<commit_message>
Creating Lab 4 work
</commit_message>
<xml_diff>
--- a/submission/lab3_Bayes_Filter/Lab3_Bayes_Filter_Report.docx
+++ b/submission/lab3_Bayes_Filter/Lab3_Bayes_Filter_Report.docx
@@ -837,15 +837,10 @@
     </w:p>
     <w:p>
       <w:pPr>
-        <w:keepNext/>
-        <w:spacing w:before="60" w:after="100"/>
-      </w:pPr>
-    </w:p>
-    <w:p>
-      <w:pPr>
         <w:pStyle w:val="Heading2"/>
       </w:pPr>
       <w:r>
+        <w:lastRenderedPageBreak/>
         <w:t>Assignment 2: How open-door detection works</w:t>
       </w:r>
     </w:p>
@@ -1280,6 +1275,7 @@
         <w:rPr>
           <w:noProof/>
         </w:rPr>
+        <w:lastRenderedPageBreak/>
         <mc:AlternateContent>
           <mc:Choice Requires="wps">
             <w:drawing>
@@ -1920,6 +1916,51 @@
     </w:p>
     <w:p>
       <w:pPr>
+        <w:spacing w:after="120"/>
+      </w:pPr>
+    </w:p>
+    <w:p>
+      <w:pPr>
+        <w:spacing w:after="120"/>
+      </w:pPr>
+    </w:p>
+    <w:p>
+      <w:pPr>
+        <w:spacing w:after="120"/>
+      </w:pPr>
+    </w:p>
+    <w:p>
+      <w:pPr>
+        <w:spacing w:after="120"/>
+      </w:pPr>
+    </w:p>
+    <w:p>
+      <w:pPr>
+        <w:spacing w:after="120"/>
+      </w:pPr>
+    </w:p>
+    <w:p>
+      <w:pPr>
+        <w:spacing w:after="120"/>
+      </w:pPr>
+    </w:p>
+    <w:p>
+      <w:pPr>
+        <w:spacing w:after="120"/>
+      </w:pPr>
+    </w:p>
+    <w:p>
+      <w:pPr>
+        <w:spacing w:after="120"/>
+      </w:pPr>
+    </w:p>
+    <w:p>
+      <w:pPr>
+        <w:spacing w:after="120"/>
+      </w:pPr>
+    </w:p>
+    <w:p>
+      <w:pPr>
         <w:pStyle w:val="Heading1"/>
       </w:pPr>
     </w:p>
@@ -1960,11 +2001,7 @@
         <w:spacing w:after="120"/>
       </w:pPr>
       <w:r>
-        <w:t xml:space="preserve">Write the node that subscribes to the feature-mean topic and, for a given time window and given threshold value, reports how many times the signal was above and below the threshold. Use the </w:t>
-      </w:r>
-      <w:r>
-        <w:lastRenderedPageBreak/>
-        <w:t xml:space="preserve">measurements to estimate the four conditional probabilities: </w:t>
+        <w:t xml:space="preserve">Write the node that subscribes to the feature-mean topic and, for a given time window and given threshold value, reports how many times the signal was above and below the threshold. Use the measurements to estimate the four conditional probabilities: </w:t>
       </w:r>
       <w:proofErr w:type="gramStart"/>
       <w:r>
@@ -2000,7 +2037,12 @@
     </w:p>
     <w:p>
       <w:r>
-        <w:t>Extend the control node to use Bayesian inference to decide if the door is open. The node should estimate the probability of the door being open and compare it with a threshold. The threshold is a tradeoff between not bumping into the door and the motion delay. Good values are 0.999, 0.9999, or 0.99999, etc. Submit the code and calculated beliefs during the transition.</w:t>
+        <w:t>Extend the control node to use Bayesian inference to decide if the door is open. The node should estimate the probability of the door being open and compare it with a threshold. The threshold is a tradeoff between not bumping into the door and the motion delay. Good values are 0.999, 0.9999, or 0.99999, etc. Submit the code and calculated beliefs during the t</w:t>
+      </w:r>
+      <w:bookmarkStart w:id="0" w:name="_GoBack"/>
+      <w:bookmarkEnd w:id="0"/>
+      <w:r>
+        <w:t>ransition.</w:t>
       </w:r>
       <w:r>
         <w:br w:type="page"/>
@@ -2086,8 +2128,6 @@
       <w:r>
         <w:t xml:space="preserve"> using the Bayes filter. Use the probabilities you measured to design the prediction and measurement model. The robot should move if the estimated probability of the door being open is 0.99 or higher. Submit the code and demonstrate to the instructor that your estimator works.</w:t>
       </w:r>
-      <w:bookmarkStart w:id="0" w:name="_GoBack"/>
-      <w:bookmarkEnd w:id="0"/>
     </w:p>
     <w:sectPr>
       <w:headerReference w:type="default" r:id="rId11"/>
@@ -2165,7 +2205,7 @@
         <w:sz w:val="17"/>
         <w:szCs w:val="17"/>
       </w:rPr>
-      <w:t>1</w:t>
+      <w:t>4</w:t>
     </w:r>
     <w:r>
       <w:rPr>

</xml_diff>

<commit_message>
Complete Lab 3 Bayes filter submission
</commit_message>
<xml_diff>
--- a/submission/lab3_Bayes_Filter/Lab3_Bayes_Filter_Report.docx
+++ b/submission/lab3_Bayes_Filter/Lab3_Bayes_Filter_Report.docx
@@ -1879,10 +1879,13 @@
       </w:r>
     </w:p>
     <w:p>
-      <w:pPr>
-        <w:pStyle w:val="Heading2"/>
-      </w:pPr>
-      <w:r>
+      <w:pPr/>
+      <w:r>
+        <w:t>Observed signal bands: with the fire truck visible, the open-door signal was approximately 314–317.5 (centered near 316), while the closed-door signal was approximately 321.5–325 (centered near 323).</w:t>
+      </w:r>
+    </w:p>
+    <w:p>
+      <w:pPr>
         <w:rPr>
           <w:b w:val="0"/>
           <w:bCs w:val="0"/>
@@ -1890,118 +1893,479 @@
           <w:sz w:val="21"/>
           <w:szCs w:val="21"/>
         </w:rPr>
-        <w:t xml:space="preserve">Open door: the signal wanders between about 314 and 317.5, </w:t>
-      </w:r>
-      <w:proofErr w:type="spellStart"/>
+      </w:pPr>
+      <w:r>
+        <w:t>Threshold selection: (316 + 323) / 2 ≈ 319.5. A measurement below 319.5 is classified as z=open, and a measurement at or above 319.5 is classified as z=closed.</w:t>
+      </w:r>
+    </w:p>
+    <w:p>
+      <w:pPr>
+        <w:pStyle w:val="Heading3"/>
+        <w:spacing w:after="100" w:line="250" w:lineRule="auto"/>
+      </w:pPr>
+      <w:r>
+        <w:t>Measured conditional probabilities</w:t>
+      </w:r>
+    </w:p>
+    <w:p>
+      <w:pPr>
+        <w:spacing w:after="100" w:line="250" w:lineRule="auto"/>
+      </w:pPr>
+      <w:r>
+        <w:t>Two 30-second windows were collected with the actual door state held open and closed. The raw-frequency estimates are:</w:t>
+      </w:r>
+    </w:p>
+    <w:tbl>
+      <w:tblPr>
+        <w:tblStyle w:val="TableGrid"/>
+        <w:tblW w:w="7800" w:type="dxa"/>
+        <w:tblLayout w:type="fixed"/>
+      </w:tblPr>
+      <w:tblGrid>
+        <w:gridCol w:w="1250"/>
+        <w:gridCol w:w="750"/>
+        <w:gridCol w:w="900"/>
+        <w:gridCol w:w="950"/>
+        <w:gridCol w:w="1900"/>
+        <w:gridCol w:w="2050"/>
+      </w:tblGrid>
+      <w:tr>
+        <w:tc>
+          <w:tcPr>
+            <w:tcW w:w="1250" w:type="dxa"/>
+            <w:tcMar>
+              <w:top w:w="70" w:type="dxa"/>
+              <w:left w:w="70" w:type="dxa"/>
+              <w:bottom w:w="70" w:type="dxa"/>
+              <w:right w:w="70" w:type="dxa"/>
+            </w:tcMar>
+          </w:tcPr>
+          <w:p>
+            <w:pPr>
+              <w:spacing w:after="30" w:line="250" w:lineRule="auto"/>
+            </w:pPr>
+            <w:r>
+              <w:rPr>
+                <w:b/>
+              </w:rPr>
+              <w:t>Actual state</w:t>
+            </w:r>
+          </w:p>
+        </w:tc>
+        <w:tc>
+          <w:tcPr>
+            <w:tcW w:w="750" w:type="dxa"/>
+            <w:tcMar>
+              <w:top w:w="70" w:type="dxa"/>
+              <w:left w:w="70" w:type="dxa"/>
+              <w:bottom w:w="70" w:type="dxa"/>
+              <w:right w:w="70" w:type="dxa"/>
+            </w:tcMar>
+          </w:tcPr>
+          <w:p>
+            <w:pPr>
+              <w:spacing w:after="30" w:line="250" w:lineRule="auto"/>
+            </w:pPr>
+            <w:r>
+              <w:rPr>
+                <w:b/>
+              </w:rPr>
+              <w:t>Total</w:t>
+            </w:r>
+          </w:p>
+        </w:tc>
+        <w:tc>
+          <w:tcPr>
+            <w:tcW w:w="900" w:type="dxa"/>
+            <w:tcMar>
+              <w:top w:w="70" w:type="dxa"/>
+              <w:left w:w="70" w:type="dxa"/>
+              <w:bottom w:w="70" w:type="dxa"/>
+              <w:right w:w="70" w:type="dxa"/>
+            </w:tcMar>
+          </w:tcPr>
+          <w:p>
+            <w:pPr>
+              <w:spacing w:after="30" w:line="250" w:lineRule="auto"/>
+            </w:pPr>
+            <w:r>
+              <w:rPr>
+                <w:b/>
+              </w:rPr>
+              <w:t>z=open</w:t>
+            </w:r>
+          </w:p>
+        </w:tc>
+        <w:tc>
+          <w:tcPr>
+            <w:tcW w:w="950" w:type="dxa"/>
+            <w:tcMar>
+              <w:top w:w="70" w:type="dxa"/>
+              <w:left w:w="70" w:type="dxa"/>
+              <w:bottom w:w="70" w:type="dxa"/>
+              <w:right w:w="70" w:type="dxa"/>
+            </w:tcMar>
+          </w:tcPr>
+          <w:p>
+            <w:pPr>
+              <w:spacing w:after="30" w:line="250" w:lineRule="auto"/>
+            </w:pPr>
+            <w:r>
+              <w:rPr>
+                <w:b/>
+              </w:rPr>
+              <w:t>z=closed</w:t>
+            </w:r>
+          </w:p>
+        </w:tc>
+        <w:tc>
+          <w:tcPr>
+            <w:tcW w:w="1900" w:type="dxa"/>
+            <w:tcMar>
+              <w:top w:w="70" w:type="dxa"/>
+              <w:left w:w="70" w:type="dxa"/>
+              <w:bottom w:w="70" w:type="dxa"/>
+              <w:right w:w="70" w:type="dxa"/>
+            </w:tcMar>
+          </w:tcPr>
+          <w:p>
+            <w:pPr>
+              <w:spacing w:after="30" w:line="250" w:lineRule="auto"/>
+            </w:pPr>
+            <w:r>
+              <w:rPr>
+                <w:b/>
+              </w:rPr>
+              <w:t>P(z=open | x)</w:t>
+            </w:r>
+          </w:p>
+        </w:tc>
+        <w:tc>
+          <w:tcPr>
+            <w:tcW w:w="2050" w:type="dxa"/>
+            <w:tcMar>
+              <w:top w:w="70" w:type="dxa"/>
+              <w:left w:w="70" w:type="dxa"/>
+              <w:bottom w:w="70" w:type="dxa"/>
+              <w:right w:w="70" w:type="dxa"/>
+            </w:tcMar>
+          </w:tcPr>
+          <w:p>
+            <w:pPr>
+              <w:spacing w:after="30" w:line="250" w:lineRule="auto"/>
+            </w:pPr>
+            <w:r>
+              <w:rPr>
+                <w:b/>
+              </w:rPr>
+              <w:t>P(z=closed | x)</w:t>
+            </w:r>
+          </w:p>
+        </w:tc>
+      </w:tr>
+      <w:tr>
+        <w:tc>
+          <w:tcPr>
+            <w:tcW w:w="1250" w:type="dxa"/>
+            <w:tcMar>
+              <w:top w:w="70" w:type="dxa"/>
+              <w:left w:w="70" w:type="dxa"/>
+              <w:bottom w:w="70" w:type="dxa"/>
+              <w:right w:w="70" w:type="dxa"/>
+            </w:tcMar>
+          </w:tcPr>
+          <w:p>
+            <w:pPr>
+              <w:spacing w:after="30" w:line="250" w:lineRule="auto"/>
+            </w:pPr>
+            <w:r>
+              <w:t>open</w:t>
+            </w:r>
+          </w:p>
+        </w:tc>
+        <w:tc>
+          <w:tcPr>
+            <w:tcW w:w="750" w:type="dxa"/>
+            <w:tcMar>
+              <w:top w:w="70" w:type="dxa"/>
+              <w:left w:w="70" w:type="dxa"/>
+              <w:bottom w:w="70" w:type="dxa"/>
+              <w:right w:w="70" w:type="dxa"/>
+            </w:tcMar>
+          </w:tcPr>
+          <w:p>
+            <w:pPr>
+              <w:spacing w:after="30" w:line="250" w:lineRule="auto"/>
+            </w:pPr>
+            <w:r>
+              <w:t>876</w:t>
+            </w:r>
+          </w:p>
+        </w:tc>
+        <w:tc>
+          <w:tcPr>
+            <w:tcW w:w="900" w:type="dxa"/>
+            <w:tcMar>
+              <w:top w:w="70" w:type="dxa"/>
+              <w:left w:w="70" w:type="dxa"/>
+              <w:bottom w:w="70" w:type="dxa"/>
+              <w:right w:w="70" w:type="dxa"/>
+            </w:tcMar>
+          </w:tcPr>
+          <w:p>
+            <w:pPr>
+              <w:spacing w:after="30" w:line="250" w:lineRule="auto"/>
+            </w:pPr>
+            <w:r>
+              <w:t>866</w:t>
+            </w:r>
+          </w:p>
+        </w:tc>
+        <w:tc>
+          <w:tcPr>
+            <w:tcW w:w="950" w:type="dxa"/>
+            <w:tcMar>
+              <w:top w:w="70" w:type="dxa"/>
+              <w:left w:w="70" w:type="dxa"/>
+              <w:bottom w:w="70" w:type="dxa"/>
+              <w:right w:w="70" w:type="dxa"/>
+            </w:tcMar>
+          </w:tcPr>
+          <w:p>
+            <w:pPr>
+              <w:spacing w:after="30" w:line="250" w:lineRule="auto"/>
+            </w:pPr>
+            <w:r>
+              <w:t>10</w:t>
+            </w:r>
+          </w:p>
+        </w:tc>
+        <w:tc>
+          <w:tcPr>
+            <w:tcW w:w="1900" w:type="dxa"/>
+            <w:tcMar>
+              <w:top w:w="70" w:type="dxa"/>
+              <w:left w:w="70" w:type="dxa"/>
+              <w:bottom w:w="70" w:type="dxa"/>
+              <w:right w:w="70" w:type="dxa"/>
+            </w:tcMar>
+          </w:tcPr>
+          <w:p>
+            <w:pPr>
+              <w:spacing w:after="30" w:line="250" w:lineRule="auto"/>
+            </w:pPr>
+            <w:r>
+              <w:t>0.988584</w:t>
+            </w:r>
+          </w:p>
+        </w:tc>
+        <w:tc>
+          <w:tcPr>
+            <w:tcW w:w="2050" w:type="dxa"/>
+            <w:tcMar>
+              <w:top w:w="70" w:type="dxa"/>
+              <w:left w:w="70" w:type="dxa"/>
+              <w:bottom w:w="70" w:type="dxa"/>
+              <w:right w:w="70" w:type="dxa"/>
+            </w:tcMar>
+          </w:tcPr>
+          <w:p>
+            <w:pPr>
+              <w:spacing w:after="30" w:line="250" w:lineRule="auto"/>
+            </w:pPr>
+            <w:r>
+              <w:t>0.011416</w:t>
+            </w:r>
+          </w:p>
+        </w:tc>
+      </w:tr>
+      <w:tr>
+        <w:tc>
+          <w:tcPr>
+            <w:tcW w:w="1250" w:type="dxa"/>
+            <w:tcMar>
+              <w:top w:w="70" w:type="dxa"/>
+              <w:left w:w="70" w:type="dxa"/>
+              <w:bottom w:w="70" w:type="dxa"/>
+              <w:right w:w="70" w:type="dxa"/>
+            </w:tcMar>
+          </w:tcPr>
+          <w:p>
+            <w:pPr>
+              <w:spacing w:after="30" w:line="250" w:lineRule="auto"/>
+            </w:pPr>
+            <w:r>
+              <w:t>closed</w:t>
+            </w:r>
+          </w:p>
+        </w:tc>
+        <w:tc>
+          <w:tcPr>
+            <w:tcW w:w="750" w:type="dxa"/>
+            <w:tcMar>
+              <w:top w:w="70" w:type="dxa"/>
+              <w:left w:w="70" w:type="dxa"/>
+              <w:bottom w:w="70" w:type="dxa"/>
+              <w:right w:w="70" w:type="dxa"/>
+            </w:tcMar>
+          </w:tcPr>
+          <w:p>
+            <w:pPr>
+              <w:spacing w:after="30" w:line="250" w:lineRule="auto"/>
+            </w:pPr>
+            <w:r>
+              <w:t>882</w:t>
+            </w:r>
+          </w:p>
+        </w:tc>
+        <w:tc>
+          <w:tcPr>
+            <w:tcW w:w="900" w:type="dxa"/>
+            <w:tcMar>
+              <w:top w:w="70" w:type="dxa"/>
+              <w:left w:w="70" w:type="dxa"/>
+              <w:bottom w:w="70" w:type="dxa"/>
+              <w:right w:w="70" w:type="dxa"/>
+            </w:tcMar>
+          </w:tcPr>
+          <w:p>
+            <w:pPr>
+              <w:spacing w:after="30" w:line="250" w:lineRule="auto"/>
+            </w:pPr>
+            <w:r>
+              <w:t>10</w:t>
+            </w:r>
+          </w:p>
+        </w:tc>
+        <w:tc>
+          <w:tcPr>
+            <w:tcW w:w="950" w:type="dxa"/>
+            <w:tcMar>
+              <w:top w:w="70" w:type="dxa"/>
+              <w:left w:w="70" w:type="dxa"/>
+              <w:bottom w:w="70" w:type="dxa"/>
+              <w:right w:w="70" w:type="dxa"/>
+            </w:tcMar>
+          </w:tcPr>
+          <w:p>
+            <w:pPr>
+              <w:spacing w:after="30" w:line="250" w:lineRule="auto"/>
+            </w:pPr>
+            <w:r>
+              <w:t>872</w:t>
+            </w:r>
+          </w:p>
+        </w:tc>
+        <w:tc>
+          <w:tcPr>
+            <w:tcW w:w="1900" w:type="dxa"/>
+            <w:tcMar>
+              <w:top w:w="70" w:type="dxa"/>
+              <w:left w:w="70" w:type="dxa"/>
+              <w:bottom w:w="70" w:type="dxa"/>
+              <w:right w:w="70" w:type="dxa"/>
+            </w:tcMar>
+          </w:tcPr>
+          <w:p>
+            <w:pPr>
+              <w:spacing w:after="30" w:line="250" w:lineRule="auto"/>
+            </w:pPr>
+            <w:r>
+              <w:t>0.011338</w:t>
+            </w:r>
+          </w:p>
+        </w:tc>
+        <w:tc>
+          <w:tcPr>
+            <w:tcW w:w="2050" w:type="dxa"/>
+            <w:tcMar>
+              <w:top w:w="70" w:type="dxa"/>
+              <w:left w:w="70" w:type="dxa"/>
+              <w:bottom w:w="70" w:type="dxa"/>
+              <w:right w:w="70" w:type="dxa"/>
+            </w:tcMar>
+          </w:tcPr>
+          <w:p>
+            <w:pPr>
+              <w:spacing w:after="30" w:line="250" w:lineRule="auto"/>
+            </w:pPr>
+            <w:r>
+              <w:t>0.988662</w:t>
+            </w:r>
+          </w:p>
+        </w:tc>
+      </w:tr>
+    </w:tbl>
+    <w:p>
+      <w:pPr>
+        <w:spacing w:after="100" w:line="250" w:lineRule="auto"/>
+      </w:pPr>
+      <w:r>
+        <w:t>The four probabilities sum to one within each actual-state row. The rare samples on the wrong side of 319.5 are the false-open and false-closed measurements that motivate Bayesian filtering.</w:t>
+      </w:r>
+    </w:p>
+    <w:p>
+      <w:pPr>
+        <w:spacing w:after="120"/>
+        <w:jc w:val="center"/>
+      </w:pPr>
       <w:r>
         <w:rPr>
-          <w:b w:val="0"/>
-          <w:bCs w:val="0"/>
-          <w:color w:val="auto"/>
-          <w:sz w:val="21"/>
-          <w:szCs w:val="21"/>
+          <w:noProof/>
         </w:rPr>
-        <w:t>centred</w:t>
-      </w:r>
-      <w:proofErr w:type="spellEnd"/>
-      <w:r>
-        <w:rPr>
-          <w:b w:val="0"/>
-          <w:bCs w:val="0"/>
-          <w:color w:val="auto"/>
-          <w:sz w:val="21"/>
-          <w:szCs w:val="21"/>
-        </w:rPr>
-        <w:t xml:space="preserve"> near 316.</w:t>
-      </w:r>
-      <w:r>
-        <w:rPr>
-          <w:b w:val="0"/>
-          <w:bCs w:val="0"/>
-          <w:color w:val="auto"/>
-          <w:sz w:val="21"/>
-          <w:szCs w:val="21"/>
-        </w:rPr>
-        <w:br/>
-      </w:r>
-      <w:r>
-        <w:rPr>
-          <w:b w:val="0"/>
-          <w:bCs w:val="0"/>
-          <w:color w:val="auto"/>
-          <w:sz w:val="21"/>
-          <w:szCs w:val="21"/>
-        </w:rPr>
-        <w:t xml:space="preserve">Closed door: the signal wanders between about 321.5 and 325, </w:t>
-      </w:r>
-      <w:proofErr w:type="spellStart"/>
-      <w:r>
-        <w:rPr>
-          <w:b w:val="0"/>
-          <w:bCs w:val="0"/>
-          <w:color w:val="auto"/>
-          <w:sz w:val="21"/>
-          <w:szCs w:val="21"/>
-        </w:rPr>
-        <w:t>centred</w:t>
-      </w:r>
-      <w:proofErr w:type="spellEnd"/>
-      <w:r>
-        <w:rPr>
-          <w:b w:val="0"/>
-          <w:bCs w:val="0"/>
-          <w:color w:val="auto"/>
-          <w:sz w:val="21"/>
-          <w:szCs w:val="21"/>
-        </w:rPr>
-        <w:t xml:space="preserve"> near 323.</w:t>
-      </w:r>
-      <w:r>
-        <w:rPr>
-          <w:b w:val="0"/>
-          <w:bCs w:val="0"/>
-          <w:color w:val="auto"/>
-          <w:sz w:val="21"/>
-          <w:szCs w:val="21"/>
-        </w:rPr>
-        <w:br/>
-      </w:r>
-      <w:r>
-        <w:rPr>
-          <w:b w:val="0"/>
-          <w:bCs w:val="0"/>
-          <w:color w:val="auto"/>
-          <w:sz w:val="21"/>
-          <w:szCs w:val="21"/>
-        </w:rPr>
-        <w:t xml:space="preserve">Gap: the two bands are separated by roughly 4 </w:t>
-      </w:r>
-      <w:proofErr w:type="spellStart"/>
-      <w:proofErr w:type="gramStart"/>
-      <w:r>
-        <w:rPr>
-          <w:b w:val="0"/>
-          <w:bCs w:val="0"/>
-          <w:color w:val="auto"/>
-          <w:sz w:val="21"/>
-          <w:szCs w:val="21"/>
-        </w:rPr>
-        <w:t>px</w:t>
-      </w:r>
-      <w:proofErr w:type="spellEnd"/>
-      <w:proofErr w:type="gramEnd"/>
-      <w:r>
-        <w:rPr>
-          <w:b w:val="0"/>
-          <w:bCs w:val="0"/>
-          <w:color w:val="auto"/>
-          <w:sz w:val="21"/>
-          <w:szCs w:val="21"/>
-        </w:rPr>
-        <w:t>, with the open band’s peak near 317.5 and the closed band’s floor near 321.5.</w:t>
-      </w:r>
-      <w:r>
-        <w:t xml:space="preserve"> </w:t>
+        <w:drawing>
+          <wp:inline distT="0" distB="0" distL="0" distR="0" wp14:anchorId="61C5B2E4" wp14:editId="233A24B9">
+            <wp:extent cx="5715000" cy="3876000"/>
+            <wp:effectExtent l="0" t="0" r="0" b="0"/>
+            <wp:docPr id="7" name="Assignment 5 threshold plot" descr="Annotated feature-mean plot showing open and closed bands, threshold, and confusing measurements"/>
+            <wp:cNvGraphicFramePr>
+              <a:graphicFrameLocks xmlns:a="http://schemas.openxmlformats.org/drawingml/2006/main" noChangeAspect="1"/>
+            </wp:cNvGraphicFramePr>
+            <a:graphic xmlns:a="http://schemas.openxmlformats.org/drawingml/2006/main">
+              <a:graphicData uri="http://schemas.openxmlformats.org/drawingml/2006/picture">
+                <pic:pic xmlns:pic="http://schemas.openxmlformats.org/drawingml/2006/picture">
+                  <pic:nvPicPr>
+                    <pic:cNvPr id="1" name=""/>
+                    <pic:cNvPicPr/>
+                  </pic:nvPicPr>
+                  <pic:blipFill>
+                    <a:blip r:embed="rId15"/>
+                    <a:stretch>
+                      <a:fillRect/>
+                    </a:stretch>
+                  </pic:blipFill>
+                  <pic:spPr>
+                    <a:xfrm>
+                      <a:off x="0" y="0"/>
+                      <a:ext cx="5715000" cy="3876000"/>
+                    </a:xfrm>
+                    <a:prstGeom prst="rect">
+                      <a:avLst/>
+                    </a:prstGeom>
+                  </pic:spPr>
+                </pic:pic>
+              </a:graphicData>
+            </a:graphic>
+          </wp:inline>
+        </w:drawing>
+      </w:r>
+    </w:p>
+    <w:p>
+      <w:pPr>
+        <w:pStyle w:val="Caption"/>
+        <w:spacing w:after="100" w:line="250" w:lineRule="auto"/>
+        <w:jc w:val="center"/>
+      </w:pPr>
+      <w:r>
+        <w:t>Figure 5: Annotated /feature_mean signal for the open/closed experiment with threshold 319.5. The marked samples illustrate measurements that can be confused by a one-sample threshold test.</w:t>
+      </w:r>
+    </w:p>
+    <w:p>
+      <w:pPr>
+        <w:spacing w:after="100" w:line="250" w:lineRule="auto"/>
+      </w:pPr>
+      <w:r>
+        <w:t>Implementation: prob_rob_labs/src/lab3_bayes/feature_stats.py. Evidence: evidence/logs/assignment5_open_stats.log, evidence/logs/assignment5_closed_stats.log, and evidence/assignment5_threshold_plot_annotated.png.</w:t>
       </w:r>
     </w:p>
     <w:p>
@@ -2016,59 +2380,864 @@
         </w:rPr>
       </w:pPr>
       <w:r>
+        <w:t>Assignment 6: Bayesian inference to decide if the door is open</w:t>
+      </w:r>
+    </w:p>
+    <w:p>
+      <w:r>
+        <w:t>Extend the control node to use Bayesian inference to decide if the door is open. The node should estimate the probability of the door being open and compare it with a threshold. The threshold is a tradeoff between not bumping into the door and the motion delay. Good values are 0.999, 0.9999, or 0.99999, etc. Submit the code and calculated beliefs during the transition.</w:t>
+      </w:r>
+    </w:p>
+    <w:p/>
+    <w:p>
+      <w:pPr>
+        <w:pStyle w:val="Heading3"/>
+        <w:spacing w:after="100" w:line="250" w:lineRule="auto"/>
+      </w:pPr>
+      <w:r>
+        <w:t>Bayesian measurement update</w:t>
+      </w:r>
+    </w:p>
+    <w:p>
+      <w:pPr>
+        <w:spacing w:after="100" w:line="250" w:lineRule="auto"/>
+      </w:pPr>
+      <w:r>
+        <w:t>The controller maintains b(open), the probability that the door is open. For each classified measurement z, it computes b'(open) = η P(z | open)b(open), where η normalizes the open and closed hypotheses. The controller used threshold 319.5, P(z=open | x=open)=0.988584, P(z=open | x=closed)=0.008065 from the calibration used for this recorded run, and a motion decision threshold of 0.9999.</w:t>
+      </w:r>
+    </w:p>
+    <w:p>
+      <w:pPr>
+        <w:spacing w:after="100" w:line="250" w:lineRule="auto"/>
+      </w:pPr>
+      <w:r>
         <w:rPr>
-          <w:b w:val="0"/>
-          <w:bCs w:val="0"/>
-          <w:color w:val="auto"/>
-          <w:sz w:val="21"/>
-          <w:szCs w:val="21"/>
+          <w:b/>
         </w:rPr>
-        <w:t xml:space="preserve">Midpoint: (316 + 323) / </w:t>
-      </w:r>
-      <w:proofErr w:type="gramStart"/>
-      <w:r>
-        <w:rPr>
-          <w:b w:val="0"/>
-          <w:bCs w:val="0"/>
-          <w:color w:val="auto"/>
-          <w:sz w:val="21"/>
-          <w:szCs w:val="21"/>
-        </w:rPr>
-        <w:t>2</w:t>
-      </w:r>
-      <w:proofErr w:type="gramEnd"/>
-      <w:r>
-        <w:rPr>
-          <w:b w:val="0"/>
-          <w:bCs w:val="0"/>
-          <w:color w:val="auto"/>
-          <w:sz w:val="21"/>
-          <w:szCs w:val="21"/>
-        </w:rPr>
-        <w:t xml:space="preserve"> ≈ 319.5. Placing the threshold midway gives equal margin to each side and balances the two error types.</w:t>
-      </w:r>
-    </w:p>
-    <w:p>
-      <w:pPr>
-        <w:pStyle w:val="Heading2"/>
-        <w:rPr>
-          <w:b w:val="0"/>
-          <w:bCs w:val="0"/>
-          <w:color w:val="auto"/>
-          <w:sz w:val="21"/>
-          <w:szCs w:val="21"/>
-        </w:rPr>
-      </w:pPr>
-      <w:r>
-        <w:t>Assignment 6: Bayesian inference to decide if the door is open</w:t>
-      </w:r>
-    </w:p>
-    <w:p>
-      <w:r>
-        <w:t>Extend the control node to use Bayesian inference to decide if the door is open. The node should estimate the probability of the door being open and compare it with a threshold. The threshold is a tradeoff between not bumping into the door and the motion delay. Good values are 0.999, 0.9999, or 0.99999, etc. Submit the code and calculated beliefs during the transition.</w:t>
-      </w:r>
-    </w:p>
-    <w:p/>
+        <w:t>Selected calculated beliefs during the closed-to-open transition:</w:t>
+      </w:r>
+    </w:p>
+    <w:tbl>
+      <w:tblPr>
+        <w:tblStyle w:val="TableGrid"/>
+        <w:tblW w:w="7700" w:type="dxa"/>
+        <w:tblLayout w:type="fixed"/>
+      </w:tblPr>
+      <w:tblGrid>
+        <w:gridCol w:w="1650"/>
+        <w:gridCol w:w="1550"/>
+        <w:gridCol w:w="2200"/>
+        <w:gridCol w:w="2300"/>
+      </w:tblGrid>
+      <w:tr>
+        <w:tc>
+          <w:tcPr>
+            <w:tcW w:w="1650" w:type="dxa"/>
+            <w:tcMar>
+              <w:top w:w="70" w:type="dxa"/>
+              <w:left w:w="70" w:type="dxa"/>
+              <w:bottom w:w="70" w:type="dxa"/>
+              <w:right w:w="70" w:type="dxa"/>
+            </w:tcMar>
+          </w:tcPr>
+          <w:p>
+            <w:pPr>
+              <w:spacing w:after="30" w:line="250" w:lineRule="auto"/>
+            </w:pPr>
+            <w:r>
+              <w:rPr>
+                <w:b/>
+              </w:rPr>
+              <w:t>Measurement</w:t>
+            </w:r>
+          </w:p>
+        </w:tc>
+        <w:tc>
+          <w:tcPr>
+            <w:tcW w:w="1550" w:type="dxa"/>
+            <w:tcMar>
+              <w:top w:w="70" w:type="dxa"/>
+              <w:left w:w="70" w:type="dxa"/>
+              <w:bottom w:w="70" w:type="dxa"/>
+              <w:right w:w="70" w:type="dxa"/>
+            </w:tcMar>
+          </w:tcPr>
+          <w:p>
+            <w:pPr>
+              <w:spacing w:after="30" w:line="250" w:lineRule="auto"/>
+            </w:pPr>
+            <w:r>
+              <w:rPr>
+                <w:b/>
+              </w:rPr>
+              <w:t>feature_mean</w:t>
+            </w:r>
+          </w:p>
+        </w:tc>
+        <w:tc>
+          <w:tcPr>
+            <w:tcW w:w="2200" w:type="dxa"/>
+            <w:tcMar>
+              <w:top w:w="70" w:type="dxa"/>
+              <w:left w:w="70" w:type="dxa"/>
+              <w:bottom w:w="70" w:type="dxa"/>
+              <w:right w:w="70" w:type="dxa"/>
+            </w:tcMar>
+          </w:tcPr>
+          <w:p>
+            <w:pPr>
+              <w:spacing w:after="30" w:line="250" w:lineRule="auto"/>
+            </w:pPr>
+            <w:r>
+              <w:rPr>
+                <w:b/>
+              </w:rPr>
+              <w:t>Prior b(open)</w:t>
+            </w:r>
+          </w:p>
+        </w:tc>
+        <w:tc>
+          <w:tcPr>
+            <w:tcW w:w="2300" w:type="dxa"/>
+            <w:tcMar>
+              <w:top w:w="70" w:type="dxa"/>
+              <w:left w:w="70" w:type="dxa"/>
+              <w:bottom w:w="70" w:type="dxa"/>
+              <w:right w:w="70" w:type="dxa"/>
+            </w:tcMar>
+          </w:tcPr>
+          <w:p>
+            <w:pPr>
+              <w:spacing w:after="30" w:line="250" w:lineRule="auto"/>
+            </w:pPr>
+            <w:r>
+              <w:rPr>
+                <w:b/>
+              </w:rPr>
+              <w:t>Posterior b(open)</w:t>
+            </w:r>
+          </w:p>
+        </w:tc>
+      </w:tr>
+      <w:tr>
+        <w:tc>
+          <w:tcPr>
+            <w:tcW w:w="1650" w:type="dxa"/>
+            <w:tcMar>
+              <w:top w:w="70" w:type="dxa"/>
+              <w:left w:w="70" w:type="dxa"/>
+              <w:bottom w:w="70" w:type="dxa"/>
+              <w:right w:w="70" w:type="dxa"/>
+            </w:tcMar>
+          </w:tcPr>
+          <w:p>
+            <w:pPr>
+              <w:spacing w:after="30" w:line="250" w:lineRule="auto"/>
+            </w:pPr>
+            <w:r>
+              <w:t>z=closed</w:t>
+            </w:r>
+          </w:p>
+        </w:tc>
+        <w:tc>
+          <w:tcPr>
+            <w:tcW w:w="1550" w:type="dxa"/>
+            <w:tcMar>
+              <w:top w:w="70" w:type="dxa"/>
+              <w:left w:w="70" w:type="dxa"/>
+              <w:bottom w:w="70" w:type="dxa"/>
+              <w:right w:w="70" w:type="dxa"/>
+            </w:tcMar>
+          </w:tcPr>
+          <w:p>
+            <w:pPr>
+              <w:spacing w:after="30" w:line="250" w:lineRule="auto"/>
+            </w:pPr>
+            <w:r>
+              <w:t>324.545</w:t>
+            </w:r>
+          </w:p>
+        </w:tc>
+        <w:tc>
+          <w:tcPr>
+            <w:tcW w:w="2200" w:type="dxa"/>
+            <w:tcMar>
+              <w:top w:w="70" w:type="dxa"/>
+              <w:left w:w="70" w:type="dxa"/>
+              <w:bottom w:w="70" w:type="dxa"/>
+              <w:right w:w="70" w:type="dxa"/>
+            </w:tcMar>
+          </w:tcPr>
+          <w:p>
+            <w:pPr>
+              <w:spacing w:after="30" w:line="250" w:lineRule="auto"/>
+            </w:pPr>
+            <w:r>
+              <w:t>0.500000000</w:t>
+            </w:r>
+          </w:p>
+        </w:tc>
+        <w:tc>
+          <w:tcPr>
+            <w:tcW w:w="2300" w:type="dxa"/>
+            <w:tcMar>
+              <w:top w:w="70" w:type="dxa"/>
+              <w:left w:w="70" w:type="dxa"/>
+              <w:bottom w:w="70" w:type="dxa"/>
+              <w:right w:w="70" w:type="dxa"/>
+            </w:tcMar>
+          </w:tcPr>
+          <w:p>
+            <w:pPr>
+              <w:spacing w:after="30" w:line="250" w:lineRule="auto"/>
+            </w:pPr>
+            <w:r>
+              <w:t>0.011377873</w:t>
+            </w:r>
+          </w:p>
+        </w:tc>
+      </w:tr>
+      <w:tr>
+        <w:tc>
+          <w:tcPr>
+            <w:tcW w:w="1650" w:type="dxa"/>
+            <w:tcMar>
+              <w:top w:w="70" w:type="dxa"/>
+              <w:left w:w="70" w:type="dxa"/>
+              <w:bottom w:w="70" w:type="dxa"/>
+              <w:right w:w="70" w:type="dxa"/>
+            </w:tcMar>
+          </w:tcPr>
+          <w:p>
+            <w:pPr>
+              <w:spacing w:after="30" w:line="250" w:lineRule="auto"/>
+            </w:pPr>
+            <w:r>
+              <w:t>z=closed</w:t>
+            </w:r>
+          </w:p>
+        </w:tc>
+        <w:tc>
+          <w:tcPr>
+            <w:tcW w:w="1550" w:type="dxa"/>
+            <w:tcMar>
+              <w:top w:w="70" w:type="dxa"/>
+              <w:left w:w="70" w:type="dxa"/>
+              <w:bottom w:w="70" w:type="dxa"/>
+              <w:right w:w="70" w:type="dxa"/>
+            </w:tcMar>
+          </w:tcPr>
+          <w:p>
+            <w:pPr>
+              <w:spacing w:after="30" w:line="250" w:lineRule="auto"/>
+            </w:pPr>
+            <w:r>
+              <w:t>323.638</w:t>
+            </w:r>
+          </w:p>
+        </w:tc>
+        <w:tc>
+          <w:tcPr>
+            <w:tcW w:w="2200" w:type="dxa"/>
+            <w:tcMar>
+              <w:top w:w="70" w:type="dxa"/>
+              <w:left w:w="70" w:type="dxa"/>
+              <w:bottom w:w="70" w:type="dxa"/>
+              <w:right w:w="70" w:type="dxa"/>
+            </w:tcMar>
+          </w:tcPr>
+          <w:p>
+            <w:pPr>
+              <w:spacing w:after="30" w:line="250" w:lineRule="auto"/>
+            </w:pPr>
+            <w:r>
+              <w:t>0.011377873</w:t>
+            </w:r>
+          </w:p>
+        </w:tc>
+        <w:tc>
+          <w:tcPr>
+            <w:tcW w:w="2300" w:type="dxa"/>
+            <w:tcMar>
+              <w:top w:w="70" w:type="dxa"/>
+              <w:left w:w="70" w:type="dxa"/>
+              <w:bottom w:w="70" w:type="dxa"/>
+              <w:right w:w="70" w:type="dxa"/>
+            </w:tcMar>
+          </w:tcPr>
+          <w:p>
+            <w:pPr>
+              <w:spacing w:after="30" w:line="250" w:lineRule="auto"/>
+            </w:pPr>
+            <w:r>
+              <w:t>0.000132435</w:t>
+            </w:r>
+          </w:p>
+        </w:tc>
+      </w:tr>
+      <w:tr>
+        <w:tc>
+          <w:tcPr>
+            <w:tcW w:w="1650" w:type="dxa"/>
+            <w:tcMar>
+              <w:top w:w="70" w:type="dxa"/>
+              <w:left w:w="70" w:type="dxa"/>
+              <w:bottom w:w="70" w:type="dxa"/>
+              <w:right w:w="70" w:type="dxa"/>
+            </w:tcMar>
+          </w:tcPr>
+          <w:p>
+            <w:pPr>
+              <w:spacing w:after="30" w:line="250" w:lineRule="auto"/>
+            </w:pPr>
+            <w:r>
+              <w:t>z=open</w:t>
+            </w:r>
+          </w:p>
+        </w:tc>
+        <w:tc>
+          <w:tcPr>
+            <w:tcW w:w="1550" w:type="dxa"/>
+            <w:tcMar>
+              <w:top w:w="70" w:type="dxa"/>
+              <w:left w:w="70" w:type="dxa"/>
+              <w:bottom w:w="70" w:type="dxa"/>
+              <w:right w:w="70" w:type="dxa"/>
+            </w:tcMar>
+          </w:tcPr>
+          <w:p>
+            <w:pPr>
+              <w:spacing w:after="30" w:line="250" w:lineRule="auto"/>
+            </w:pPr>
+            <w:r>
+              <w:t>316.995</w:t>
+            </w:r>
+          </w:p>
+        </w:tc>
+        <w:tc>
+          <w:tcPr>
+            <w:tcW w:w="2200" w:type="dxa"/>
+            <w:tcMar>
+              <w:top w:w="70" w:type="dxa"/>
+              <w:left w:w="70" w:type="dxa"/>
+              <w:bottom w:w="70" w:type="dxa"/>
+              <w:right w:w="70" w:type="dxa"/>
+            </w:tcMar>
+          </w:tcPr>
+          <w:p>
+            <w:pPr>
+              <w:spacing w:after="30" w:line="250" w:lineRule="auto"/>
+            </w:pPr>
+            <w:r>
+              <w:t>≈0</w:t>
+            </w:r>
+          </w:p>
+        </w:tc>
+        <w:tc>
+          <w:tcPr>
+            <w:tcW w:w="2300" w:type="dxa"/>
+            <w:tcMar>
+              <w:top w:w="70" w:type="dxa"/>
+              <w:left w:w="70" w:type="dxa"/>
+              <w:bottom w:w="70" w:type="dxa"/>
+              <w:right w:w="70" w:type="dxa"/>
+            </w:tcMar>
+          </w:tcPr>
+          <w:p>
+            <w:pPr>
+              <w:spacing w:after="30" w:line="250" w:lineRule="auto"/>
+            </w:pPr>
+            <w:r>
+              <w:t>0.000000035</w:t>
+            </w:r>
+          </w:p>
+        </w:tc>
+      </w:tr>
+      <w:tr>
+        <w:tc>
+          <w:tcPr>
+            <w:tcW w:w="1650" w:type="dxa"/>
+            <w:tcMar>
+              <w:top w:w="70" w:type="dxa"/>
+              <w:left w:w="70" w:type="dxa"/>
+              <w:bottom w:w="70" w:type="dxa"/>
+              <w:right w:w="70" w:type="dxa"/>
+            </w:tcMar>
+          </w:tcPr>
+          <w:p>
+            <w:pPr>
+              <w:spacing w:after="30" w:line="250" w:lineRule="auto"/>
+            </w:pPr>
+            <w:r>
+              <w:t>z=open</w:t>
+            </w:r>
+          </w:p>
+        </w:tc>
+        <w:tc>
+          <w:tcPr>
+            <w:tcW w:w="1550" w:type="dxa"/>
+            <w:tcMar>
+              <w:top w:w="70" w:type="dxa"/>
+              <w:left w:w="70" w:type="dxa"/>
+              <w:bottom w:w="70" w:type="dxa"/>
+              <w:right w:w="70" w:type="dxa"/>
+            </w:tcMar>
+          </w:tcPr>
+          <w:p>
+            <w:pPr>
+              <w:spacing w:after="30" w:line="250" w:lineRule="auto"/>
+            </w:pPr>
+            <w:r>
+              <w:t>316.378</w:t>
+            </w:r>
+          </w:p>
+        </w:tc>
+        <w:tc>
+          <w:tcPr>
+            <w:tcW w:w="2200" w:type="dxa"/>
+            <w:tcMar>
+              <w:top w:w="70" w:type="dxa"/>
+              <w:left w:w="70" w:type="dxa"/>
+              <w:bottom w:w="70" w:type="dxa"/>
+              <w:right w:w="70" w:type="dxa"/>
+            </w:tcMar>
+          </w:tcPr>
+          <w:p>
+            <w:pPr>
+              <w:spacing w:after="30" w:line="250" w:lineRule="auto"/>
+            </w:pPr>
+            <w:r>
+              <w:t>0.000000035</w:t>
+            </w:r>
+          </w:p>
+        </w:tc>
+        <w:tc>
+          <w:tcPr>
+            <w:tcW w:w="2300" w:type="dxa"/>
+            <w:tcMar>
+              <w:top w:w="70" w:type="dxa"/>
+              <w:left w:w="70" w:type="dxa"/>
+              <w:bottom w:w="70" w:type="dxa"/>
+              <w:right w:w="70" w:type="dxa"/>
+            </w:tcMar>
+          </w:tcPr>
+          <w:p>
+            <w:pPr>
+              <w:spacing w:after="30" w:line="250" w:lineRule="auto"/>
+            </w:pPr>
+            <w:r>
+              <w:t>0.000004280</w:t>
+            </w:r>
+          </w:p>
+        </w:tc>
+      </w:tr>
+      <w:tr>
+        <w:tc>
+          <w:tcPr>
+            <w:tcW w:w="1650" w:type="dxa"/>
+            <w:tcMar>
+              <w:top w:w="70" w:type="dxa"/>
+              <w:left w:w="70" w:type="dxa"/>
+              <w:bottom w:w="70" w:type="dxa"/>
+              <w:right w:w="70" w:type="dxa"/>
+            </w:tcMar>
+          </w:tcPr>
+          <w:p>
+            <w:pPr>
+              <w:spacing w:after="30" w:line="250" w:lineRule="auto"/>
+            </w:pPr>
+            <w:r>
+              <w:t>z=open</w:t>
+            </w:r>
+          </w:p>
+        </w:tc>
+        <w:tc>
+          <w:tcPr>
+            <w:tcW w:w="1550" w:type="dxa"/>
+            <w:tcMar>
+              <w:top w:w="70" w:type="dxa"/>
+              <w:left w:w="70" w:type="dxa"/>
+              <w:bottom w:w="70" w:type="dxa"/>
+              <w:right w:w="70" w:type="dxa"/>
+            </w:tcMar>
+          </w:tcPr>
+          <w:p>
+            <w:pPr>
+              <w:spacing w:after="30" w:line="250" w:lineRule="auto"/>
+            </w:pPr>
+            <w:r>
+              <w:t>314.031</w:t>
+            </w:r>
+          </w:p>
+        </w:tc>
+        <w:tc>
+          <w:tcPr>
+            <w:tcW w:w="2200" w:type="dxa"/>
+            <w:tcMar>
+              <w:top w:w="70" w:type="dxa"/>
+              <w:left w:w="70" w:type="dxa"/>
+              <w:bottom w:w="70" w:type="dxa"/>
+              <w:right w:w="70" w:type="dxa"/>
+            </w:tcMar>
+          </w:tcPr>
+          <w:p>
+            <w:pPr>
+              <w:spacing w:after="30" w:line="250" w:lineRule="auto"/>
+            </w:pPr>
+            <w:r>
+              <w:t>0.000004280</w:t>
+            </w:r>
+          </w:p>
+        </w:tc>
+        <w:tc>
+          <w:tcPr>
+            <w:tcW w:w="2300" w:type="dxa"/>
+            <w:tcMar>
+              <w:top w:w="70" w:type="dxa"/>
+              <w:left w:w="70" w:type="dxa"/>
+              <w:bottom w:w="70" w:type="dxa"/>
+              <w:right w:w="70" w:type="dxa"/>
+            </w:tcMar>
+          </w:tcPr>
+          <w:p>
+            <w:pPr>
+              <w:spacing w:after="30" w:line="250" w:lineRule="auto"/>
+            </w:pPr>
+            <w:r>
+              <w:t>0.000524317</w:t>
+            </w:r>
+          </w:p>
+        </w:tc>
+      </w:tr>
+      <w:tr>
+        <w:tc>
+          <w:tcPr>
+            <w:tcW w:w="1650" w:type="dxa"/>
+            <w:tcMar>
+              <w:top w:w="70" w:type="dxa"/>
+              <w:left w:w="70" w:type="dxa"/>
+              <w:bottom w:w="70" w:type="dxa"/>
+              <w:right w:w="70" w:type="dxa"/>
+            </w:tcMar>
+          </w:tcPr>
+          <w:p>
+            <w:pPr>
+              <w:spacing w:after="30" w:line="250" w:lineRule="auto"/>
+            </w:pPr>
+            <w:r>
+              <w:t>z=open</w:t>
+            </w:r>
+          </w:p>
+        </w:tc>
+        <w:tc>
+          <w:tcPr>
+            <w:tcW w:w="1550" w:type="dxa"/>
+            <w:tcMar>
+              <w:top w:w="70" w:type="dxa"/>
+              <w:left w:w="70" w:type="dxa"/>
+              <w:bottom w:w="70" w:type="dxa"/>
+              <w:right w:w="70" w:type="dxa"/>
+            </w:tcMar>
+          </w:tcPr>
+          <w:p>
+            <w:pPr>
+              <w:spacing w:after="30" w:line="250" w:lineRule="auto"/>
+            </w:pPr>
+            <w:r>
+              <w:t>318.154</w:t>
+            </w:r>
+          </w:p>
+        </w:tc>
+        <w:tc>
+          <w:tcPr>
+            <w:tcW w:w="2200" w:type="dxa"/>
+            <w:tcMar>
+              <w:top w:w="70" w:type="dxa"/>
+              <w:left w:w="70" w:type="dxa"/>
+              <w:bottom w:w="70" w:type="dxa"/>
+              <w:right w:w="70" w:type="dxa"/>
+            </w:tcMar>
+          </w:tcPr>
+          <w:p>
+            <w:pPr>
+              <w:spacing w:after="30" w:line="250" w:lineRule="auto"/>
+            </w:pPr>
+            <w:r>
+              <w:t>0.000524317</w:t>
+            </w:r>
+          </w:p>
+        </w:tc>
+        <w:tc>
+          <w:tcPr>
+            <w:tcW w:w="2300" w:type="dxa"/>
+            <w:tcMar>
+              <w:top w:w="70" w:type="dxa"/>
+              <w:left w:w="70" w:type="dxa"/>
+              <w:bottom w:w="70" w:type="dxa"/>
+              <w:right w:w="70" w:type="dxa"/>
+            </w:tcMar>
+          </w:tcPr>
+          <w:p>
+            <w:pPr>
+              <w:spacing w:after="30" w:line="250" w:lineRule="auto"/>
+            </w:pPr>
+            <w:r>
+              <w:t>0.060417849</w:t>
+            </w:r>
+          </w:p>
+        </w:tc>
+      </w:tr>
+      <w:tr>
+        <w:tc>
+          <w:tcPr>
+            <w:tcW w:w="1650" w:type="dxa"/>
+            <w:tcMar>
+              <w:top w:w="70" w:type="dxa"/>
+              <w:left w:w="70" w:type="dxa"/>
+              <w:bottom w:w="70" w:type="dxa"/>
+              <w:right w:w="70" w:type="dxa"/>
+            </w:tcMar>
+          </w:tcPr>
+          <w:p>
+            <w:pPr>
+              <w:spacing w:after="30" w:line="250" w:lineRule="auto"/>
+            </w:pPr>
+            <w:r>
+              <w:t>z=open</w:t>
+            </w:r>
+          </w:p>
+        </w:tc>
+        <w:tc>
+          <w:tcPr>
+            <w:tcW w:w="1550" w:type="dxa"/>
+            <w:tcMar>
+              <w:top w:w="70" w:type="dxa"/>
+              <w:left w:w="70" w:type="dxa"/>
+              <w:bottom w:w="70" w:type="dxa"/>
+              <w:right w:w="70" w:type="dxa"/>
+            </w:tcMar>
+          </w:tcPr>
+          <w:p>
+            <w:pPr>
+              <w:spacing w:after="30" w:line="250" w:lineRule="auto"/>
+            </w:pPr>
+            <w:r>
+              <w:t>318.479</w:t>
+            </w:r>
+          </w:p>
+        </w:tc>
+        <w:tc>
+          <w:tcPr>
+            <w:tcW w:w="2200" w:type="dxa"/>
+            <w:tcMar>
+              <w:top w:w="70" w:type="dxa"/>
+              <w:left w:w="70" w:type="dxa"/>
+              <w:bottom w:w="70" w:type="dxa"/>
+              <w:right w:w="70" w:type="dxa"/>
+            </w:tcMar>
+          </w:tcPr>
+          <w:p>
+            <w:pPr>
+              <w:spacing w:after="30" w:line="250" w:lineRule="auto"/>
+            </w:pPr>
+            <w:r>
+              <w:t>0.060417849</w:t>
+            </w:r>
+          </w:p>
+        </w:tc>
+        <w:tc>
+          <w:tcPr>
+            <w:tcW w:w="2300" w:type="dxa"/>
+            <w:tcMar>
+              <w:top w:w="70" w:type="dxa"/>
+              <w:left w:w="70" w:type="dxa"/>
+              <w:bottom w:w="70" w:type="dxa"/>
+              <w:right w:w="70" w:type="dxa"/>
+            </w:tcMar>
+          </w:tcPr>
+          <w:p>
+            <w:pPr>
+              <w:spacing w:after="30" w:line="250" w:lineRule="auto"/>
+            </w:pPr>
+            <w:r>
+              <w:t>0.887413499</w:t>
+            </w:r>
+          </w:p>
+        </w:tc>
+      </w:tr>
+      <w:tr>
+        <w:tc>
+          <w:tcPr>
+            <w:tcW w:w="1650" w:type="dxa"/>
+            <w:tcMar>
+              <w:top w:w="70" w:type="dxa"/>
+              <w:left w:w="70" w:type="dxa"/>
+              <w:bottom w:w="70" w:type="dxa"/>
+              <w:right w:w="70" w:type="dxa"/>
+            </w:tcMar>
+          </w:tcPr>
+          <w:p>
+            <w:pPr>
+              <w:spacing w:after="30" w:line="250" w:lineRule="auto"/>
+            </w:pPr>
+            <w:r>
+              <w:t>z=open</w:t>
+            </w:r>
+          </w:p>
+        </w:tc>
+        <w:tc>
+          <w:tcPr>
+            <w:tcW w:w="1550" w:type="dxa"/>
+            <w:tcMar>
+              <w:top w:w="70" w:type="dxa"/>
+              <w:left w:w="70" w:type="dxa"/>
+              <w:bottom w:w="70" w:type="dxa"/>
+              <w:right w:w="70" w:type="dxa"/>
+            </w:tcMar>
+          </w:tcPr>
+          <w:p>
+            <w:pPr>
+              <w:spacing w:after="30" w:line="250" w:lineRule="auto"/>
+            </w:pPr>
+            <w:r>
+              <w:t>316.067</w:t>
+            </w:r>
+          </w:p>
+        </w:tc>
+        <w:tc>
+          <w:tcPr>
+            <w:tcW w:w="2200" w:type="dxa"/>
+            <w:tcMar>
+              <w:top w:w="70" w:type="dxa"/>
+              <w:left w:w="70" w:type="dxa"/>
+              <w:bottom w:w="70" w:type="dxa"/>
+              <w:right w:w="70" w:type="dxa"/>
+            </w:tcMar>
+          </w:tcPr>
+          <w:p>
+            <w:pPr>
+              <w:spacing w:after="30" w:line="250" w:lineRule="auto"/>
+            </w:pPr>
+            <w:r>
+              <w:t>0.887413499</w:t>
+            </w:r>
+          </w:p>
+        </w:tc>
+        <w:tc>
+          <w:tcPr>
+            <w:tcW w:w="2300" w:type="dxa"/>
+            <w:tcMar>
+              <w:top w:w="70" w:type="dxa"/>
+              <w:left w:w="70" w:type="dxa"/>
+              <w:bottom w:w="70" w:type="dxa"/>
+              <w:right w:w="70" w:type="dxa"/>
+            </w:tcMar>
+          </w:tcPr>
+          <w:p>
+            <w:pPr>
+              <w:spacing w:after="30" w:line="250" w:lineRule="auto"/>
+            </w:pPr>
+            <w:r>
+              <w:t>0.998966045</w:t>
+            </w:r>
+          </w:p>
+        </w:tc>
+      </w:tr>
+      <w:tr>
+        <w:tc>
+          <w:tcPr>
+            <w:tcW w:w="1650" w:type="dxa"/>
+            <w:tcMar>
+              <w:top w:w="70" w:type="dxa"/>
+              <w:left w:w="70" w:type="dxa"/>
+              <w:bottom w:w="70" w:type="dxa"/>
+              <w:right w:w="70" w:type="dxa"/>
+            </w:tcMar>
+          </w:tcPr>
+          <w:p>
+            <w:pPr>
+              <w:spacing w:after="30" w:line="250" w:lineRule="auto"/>
+            </w:pPr>
+            <w:r>
+              <w:t>z=open</w:t>
+            </w:r>
+          </w:p>
+        </w:tc>
+        <w:tc>
+          <w:tcPr>
+            <w:tcW w:w="1550" w:type="dxa"/>
+            <w:tcMar>
+              <w:top w:w="70" w:type="dxa"/>
+              <w:left w:w="70" w:type="dxa"/>
+              <w:bottom w:w="70" w:type="dxa"/>
+              <w:right w:w="70" w:type="dxa"/>
+            </w:tcMar>
+          </w:tcPr>
+          <w:p>
+            <w:pPr>
+              <w:spacing w:after="30" w:line="250" w:lineRule="auto"/>
+            </w:pPr>
+            <w:r>
+              <w:t>317.126</w:t>
+            </w:r>
+          </w:p>
+        </w:tc>
+        <w:tc>
+          <w:tcPr>
+            <w:tcW w:w="2200" w:type="dxa"/>
+            <w:tcMar>
+              <w:top w:w="70" w:type="dxa"/>
+              <w:left w:w="70" w:type="dxa"/>
+              <w:bottom w:w="70" w:type="dxa"/>
+              <w:right w:w="70" w:type="dxa"/>
+            </w:tcMar>
+          </w:tcPr>
+          <w:p>
+            <w:pPr>
+              <w:spacing w:after="30" w:line="250" w:lineRule="auto"/>
+            </w:pPr>
+            <w:r>
+              <w:t>0.998966045</w:t>
+            </w:r>
+          </w:p>
+        </w:tc>
+        <w:tc>
+          <w:tcPr>
+            <w:tcW w:w="2300" w:type="dxa"/>
+            <w:tcMar>
+              <w:top w:w="70" w:type="dxa"/>
+              <w:left w:w="70" w:type="dxa"/>
+              <w:bottom w:w="70" w:type="dxa"/>
+              <w:right w:w="70" w:type="dxa"/>
+            </w:tcMar>
+          </w:tcPr>
+          <w:p>
+            <w:pPr>
+              <w:spacing w:after="30" w:line="250" w:lineRule="auto"/>
+            </w:pPr>
+            <w:r>
+              <w:t>0.999991556</w:t>
+            </w:r>
+          </w:p>
+        </w:tc>
+      </w:tr>
+    </w:tbl>
+    <w:p>
+      <w:pPr>
+        <w:spacing w:after="100" w:line="250" w:lineRule="auto"/>
+      </w:pPr>
+      <w:r>
+        <w:t>The robot remained stopped at posterior 0.998966045 because it was still below 0.9999. It entered STATE DRIVING only after the next observation raised the belief to 0.999991556.</w:t>
+      </w:r>
+    </w:p>
+    <w:p>
+      <w:pPr>
+        <w:spacing w:after="100" w:line="250" w:lineRule="auto"/>
+      </w:pPr>
+      <w:r>
+        <w:t>Implementation: prob_rob_labs/src/lab3_bayes/filter.py and controller.py. Evidence: evidence/logs/assignment6_bayes.log and video/prob_rob_lab3_#6.mp4.</w:t>
+      </w:r>
+    </w:p>
     <w:p>
       <w:pPr>
         <w:pStyle w:val="Heading1"/>
@@ -2131,6 +3300,262 @@
     <w:p/>
     <w:p>
       <w:pPr>
+        <w:pStyle w:val="Heading3"/>
+        <w:spacing w:after="100" w:line="250" w:lineRule="auto"/>
+      </w:pPr>
+      <w:r>
+        <w:t>Experimental and source-code probabilities</w:t>
+      </w:r>
+    </w:p>
+    <w:p>
+      <w:pPr>
+        <w:spacing w:after="100" w:line="250" w:lineRule="auto"/>
+      </w:pPr>
+      <w:r>
+        <w:t>An automated ROS 2 trial node issued 25 /door_open commands. It observed whether the door opened and commanded the hinge closed after every success so that each trial began from the same closed state.</w:t>
+      </w:r>
+    </w:p>
+    <w:tbl>
+      <w:tblPr>
+        <w:tblStyle w:val="TableGrid"/>
+        <w:tblW w:w="7500" w:type="dxa"/>
+        <w:tblLayout w:type="fixed"/>
+      </w:tblPr>
+      <w:tblGrid>
+        <w:gridCol w:w="900"/>
+        <w:gridCol w:w="1050"/>
+        <w:gridCol w:w="950"/>
+        <w:gridCol w:w="2700"/>
+        <w:gridCol w:w="1900"/>
+      </w:tblGrid>
+      <w:tr>
+        <w:tc>
+          <w:tcPr>
+            <w:tcW w:w="900" w:type="dxa"/>
+            <w:tcMar>
+              <w:top w:w="70" w:type="dxa"/>
+              <w:left w:w="70" w:type="dxa"/>
+              <w:bottom w:w="70" w:type="dxa"/>
+              <w:right w:w="70" w:type="dxa"/>
+            </w:tcMar>
+          </w:tcPr>
+          <w:p>
+            <w:pPr>
+              <w:spacing w:after="30" w:line="250" w:lineRule="auto"/>
+            </w:pPr>
+            <w:r>
+              <w:rPr>
+                <w:b/>
+              </w:rPr>
+              <w:t>Trials</w:t>
+            </w:r>
+          </w:p>
+        </w:tc>
+        <w:tc>
+          <w:tcPr>
+            <w:tcW w:w="1050" w:type="dxa"/>
+            <w:tcMar>
+              <w:top w:w="70" w:type="dxa"/>
+              <w:left w:w="70" w:type="dxa"/>
+              <w:bottom w:w="70" w:type="dxa"/>
+              <w:right w:w="70" w:type="dxa"/>
+            </w:tcMar>
+          </w:tcPr>
+          <w:p>
+            <w:pPr>
+              <w:spacing w:after="30" w:line="250" w:lineRule="auto"/>
+            </w:pPr>
+            <w:r>
+              <w:rPr>
+                <w:b/>
+              </w:rPr>
+              <w:t>Successes</w:t>
+            </w:r>
+          </w:p>
+        </w:tc>
+        <w:tc>
+          <w:tcPr>
+            <w:tcW w:w="950" w:type="dxa"/>
+            <w:tcMar>
+              <w:top w:w="70" w:type="dxa"/>
+              <w:left w:w="70" w:type="dxa"/>
+              <w:bottom w:w="70" w:type="dxa"/>
+              <w:right w:w="70" w:type="dxa"/>
+            </w:tcMar>
+          </w:tcPr>
+          <w:p>
+            <w:pPr>
+              <w:spacing w:after="30" w:line="250" w:lineRule="auto"/>
+            </w:pPr>
+            <w:r>
+              <w:rPr>
+                <w:b/>
+              </w:rPr>
+              <w:t>Failures</w:t>
+            </w:r>
+          </w:p>
+        </w:tc>
+        <w:tc>
+          <w:tcPr>
+            <w:tcW w:w="2700" w:type="dxa"/>
+            <w:tcMar>
+              <w:top w:w="70" w:type="dxa"/>
+              <w:left w:w="70" w:type="dxa"/>
+              <w:bottom w:w="70" w:type="dxa"/>
+              <w:right w:w="70" w:type="dxa"/>
+            </w:tcMar>
+          </w:tcPr>
+          <w:p>
+            <w:pPr>
+              <w:spacing w:after="30" w:line="250" w:lineRule="auto"/>
+            </w:pPr>
+            <w:r>
+              <w:rPr>
+                <w:b/>
+              </w:rPr>
+              <w:t>Measured P(open | command)</w:t>
+            </w:r>
+          </w:p>
+        </w:tc>
+        <w:tc>
+          <w:tcPr>
+            <w:tcW w:w="1900" w:type="dxa"/>
+            <w:tcMar>
+              <w:top w:w="70" w:type="dxa"/>
+              <w:left w:w="70" w:type="dxa"/>
+              <w:bottom w:w="70" w:type="dxa"/>
+              <w:right w:w="70" w:type="dxa"/>
+            </w:tcMar>
+          </w:tcPr>
+          <w:p>
+            <w:pPr>
+              <w:spacing w:after="30" w:line="250" w:lineRule="auto"/>
+            </w:pPr>
+            <w:r>
+              <w:rPr>
+                <w:b/>
+              </w:rPr>
+              <w:t>Actual probability</w:t>
+            </w:r>
+          </w:p>
+        </w:tc>
+      </w:tr>
+      <w:tr>
+        <w:tc>
+          <w:tcPr>
+            <w:tcW w:w="900" w:type="dxa"/>
+            <w:tcMar>
+              <w:top w:w="70" w:type="dxa"/>
+              <w:left w:w="70" w:type="dxa"/>
+              <w:bottom w:w="70" w:type="dxa"/>
+              <w:right w:w="70" w:type="dxa"/>
+            </w:tcMar>
+          </w:tcPr>
+          <w:p>
+            <w:pPr>
+              <w:spacing w:after="30" w:line="250" w:lineRule="auto"/>
+            </w:pPr>
+            <w:r>
+              <w:t>25</w:t>
+            </w:r>
+          </w:p>
+        </w:tc>
+        <w:tc>
+          <w:tcPr>
+            <w:tcW w:w="1050" w:type="dxa"/>
+            <w:tcMar>
+              <w:top w:w="70" w:type="dxa"/>
+              <w:left w:w="70" w:type="dxa"/>
+              <w:bottom w:w="70" w:type="dxa"/>
+              <w:right w:w="70" w:type="dxa"/>
+            </w:tcMar>
+          </w:tcPr>
+          <w:p>
+            <w:pPr>
+              <w:spacing w:after="30" w:line="250" w:lineRule="auto"/>
+            </w:pPr>
+            <w:r>
+              <w:t>4</w:t>
+            </w:r>
+          </w:p>
+        </w:tc>
+        <w:tc>
+          <w:tcPr>
+            <w:tcW w:w="950" w:type="dxa"/>
+            <w:tcMar>
+              <w:top w:w="70" w:type="dxa"/>
+              <w:left w:w="70" w:type="dxa"/>
+              <w:bottom w:w="70" w:type="dxa"/>
+              <w:right w:w="70" w:type="dxa"/>
+            </w:tcMar>
+          </w:tcPr>
+          <w:p>
+            <w:pPr>
+              <w:spacing w:after="30" w:line="250" w:lineRule="auto"/>
+            </w:pPr>
+            <w:r>
+              <w:t>21</w:t>
+            </w:r>
+          </w:p>
+        </w:tc>
+        <w:tc>
+          <w:tcPr>
+            <w:tcW w:w="2700" w:type="dxa"/>
+            <w:tcMar>
+              <w:top w:w="70" w:type="dxa"/>
+              <w:left w:w="70" w:type="dxa"/>
+              <w:bottom w:w="70" w:type="dxa"/>
+              <w:right w:w="70" w:type="dxa"/>
+            </w:tcMar>
+          </w:tcPr>
+          <w:p>
+            <w:pPr>
+              <w:spacing w:after="30" w:line="250" w:lineRule="auto"/>
+            </w:pPr>
+            <w:r>
+              <w:t>4/25 = 0.16</w:t>
+            </w:r>
+          </w:p>
+        </w:tc>
+        <w:tc>
+          <w:tcPr>
+            <w:tcW w:w="1900" w:type="dxa"/>
+            <w:tcMar>
+              <w:top w:w="70" w:type="dxa"/>
+              <w:left w:w="70" w:type="dxa"/>
+              <w:bottom w:w="70" w:type="dxa"/>
+              <w:right w:w="70" w:type="dxa"/>
+            </w:tcMar>
+          </w:tcPr>
+          <w:p>
+            <w:pPr>
+              <w:spacing w:after="30" w:line="250" w:lineRule="auto"/>
+            </w:pPr>
+            <w:r>
+              <w:t>1/5 = 0.20</w:t>
+            </w:r>
+          </w:p>
+        </w:tc>
+      </w:tr>
+    </w:tbl>
+    <w:p>
+      <w:pPr>
+        <w:spacing w:after="100" w:line="250" w:lineRule="auto"/>
+      </w:pPr>
+      <w:r>
+        <w:t>The measured value differs from 0.20 because 25 Bernoulli trials have sampling variation. The source code uses random.choice([1.0, 0.0, 0.0, 0.0, 0.0]); exactly one of five equally likely outcomes applies opening torque, so the actual probability is 0.20.</w:t>
+      </w:r>
+    </w:p>
+    <w:p>
+      <w:pPr>
+        <w:spacing w:after="100" w:line="250" w:lineRule="auto"/>
+      </w:pPr>
+      <w:r>
+        <w:t>Automation: tools/run_assignment7_trials.py. Door-opener source: prob_rob_labs/src/flaky_door_opener/flaky_door_opener.py. Evidence: evidence/logs/assignment7_trials.log and video/prob_rob_lab3_#7.mp4.</w:t>
+      </w:r>
+    </w:p>
+    <w:p>
+      <w:pPr>
         <w:pStyle w:val="Heading2"/>
       </w:pPr>
       <w:r>
@@ -2143,6 +3568,568 @@
       </w:pPr>
       <w:r>
         <w:t>Design the controller that attempts to open the door using the door-opener topic, and estimates the probability of the door being opened using the Bayes filter. Use the probabilities you measured to design the prediction and measurement model. The robot should move if the estimated probability of the door being open is 0.99 or higher. Submit the code and demonstrate to the instructor that your estimator works.</w:t>
+      </w:r>
+    </w:p>
+    <w:p>
+      <w:pPr>
+        <w:pStyle w:val="Heading3"/>
+        <w:spacing w:after="100" w:line="250" w:lineRule="auto"/>
+      </w:pPr>
+      <w:r>
+        <w:t>Full Bayes-filter design and demonstration</w:t>
+      </w:r>
+    </w:p>
+    <w:p>
+      <w:pPr>
+        <w:spacing w:after="100" w:line="250" w:lineRule="auto"/>
+      </w:pPr>
+      <w:r>
+        <w:t>The full filter combines a command prediction with the camera measurement update. For an open command, the prediction is b̄(open) = b(open) + [1 − b(open)]p_success, assuming an open door remains open. The recorded experiment used the measured p_success=0.16, prior b(open)=0, measurement values P(z=open | x=open)=0.988584 and P(z=open | x=closed)=0.008065, and the required motion threshold b(open) ≥ 0.99.</w:t>
+      </w:r>
+    </w:p>
+    <w:p>
+      <w:pPr>
+        <w:spacing w:after="100" w:line="250" w:lineRule="auto"/>
+      </w:pPr>
+      <w:r>
+        <w:rPr>
+          <w:b/>
+        </w:rPr>
+        <w:t>Key events from the successful final attempt:</w:t>
+      </w:r>
+    </w:p>
+    <w:tbl>
+      <w:tblPr>
+        <w:tblStyle w:val="TableGrid"/>
+        <w:tblW w:w="8200" w:type="dxa"/>
+        <w:tblLayout w:type="fixed"/>
+      </w:tblPr>
+      <w:tblGrid>
+        <w:gridCol w:w="2100"/>
+        <w:gridCol w:w="1700"/>
+        <w:gridCol w:w="1800"/>
+        <w:gridCol w:w="2600"/>
+      </w:tblGrid>
+      <w:tr>
+        <w:tc>
+          <w:tcPr>
+            <w:tcW w:w="2100" w:type="dxa"/>
+            <w:tcMar>
+              <w:top w:w="70" w:type="dxa"/>
+              <w:left w:w="70" w:type="dxa"/>
+              <w:bottom w:w="70" w:type="dxa"/>
+              <w:right w:w="70" w:type="dxa"/>
+            </w:tcMar>
+          </w:tcPr>
+          <w:p>
+            <w:pPr>
+              <w:spacing w:after="30" w:line="250" w:lineRule="auto"/>
+            </w:pPr>
+            <w:r>
+              <w:rPr>
+                <w:b/>
+              </w:rPr>
+              <w:t>Event</w:t>
+            </w:r>
+          </w:p>
+        </w:tc>
+        <w:tc>
+          <w:tcPr>
+            <w:tcW w:w="1700" w:type="dxa"/>
+            <w:tcMar>
+              <w:top w:w="70" w:type="dxa"/>
+              <w:left w:w="70" w:type="dxa"/>
+              <w:bottom w:w="70" w:type="dxa"/>
+              <w:right w:w="70" w:type="dxa"/>
+            </w:tcMar>
+          </w:tcPr>
+          <w:p>
+            <w:pPr>
+              <w:spacing w:after="30" w:line="250" w:lineRule="auto"/>
+            </w:pPr>
+            <w:r>
+              <w:rPr>
+                <w:b/>
+              </w:rPr>
+              <w:t>Prior</w:t>
+            </w:r>
+          </w:p>
+        </w:tc>
+        <w:tc>
+          <w:tcPr>
+            <w:tcW w:w="1800" w:type="dxa"/>
+            <w:tcMar>
+              <w:top w:w="70" w:type="dxa"/>
+              <w:left w:w="70" w:type="dxa"/>
+              <w:bottom w:w="70" w:type="dxa"/>
+              <w:right w:w="70" w:type="dxa"/>
+            </w:tcMar>
+          </w:tcPr>
+          <w:p>
+            <w:pPr>
+              <w:spacing w:after="30" w:line="250" w:lineRule="auto"/>
+            </w:pPr>
+            <w:r>
+              <w:rPr>
+                <w:b/>
+              </w:rPr>
+              <w:t>Posterior</w:t>
+            </w:r>
+          </w:p>
+        </w:tc>
+        <w:tc>
+          <w:tcPr>
+            <w:tcW w:w="2600" w:type="dxa"/>
+            <w:tcMar>
+              <w:top w:w="70" w:type="dxa"/>
+              <w:left w:w="70" w:type="dxa"/>
+              <w:bottom w:w="70" w:type="dxa"/>
+              <w:right w:w="70" w:type="dxa"/>
+            </w:tcMar>
+          </w:tcPr>
+          <w:p>
+            <w:pPr>
+              <w:spacing w:after="30" w:line="250" w:lineRule="auto"/>
+            </w:pPr>
+            <w:r>
+              <w:rPr>
+                <w:b/>
+              </w:rPr>
+              <w:t>Interpretation</w:t>
+            </w:r>
+          </w:p>
+        </w:tc>
+      </w:tr>
+      <w:tr>
+        <w:tc>
+          <w:tcPr>
+            <w:tcW w:w="2100" w:type="dxa"/>
+            <w:tcMar>
+              <w:top w:w="70" w:type="dxa"/>
+              <w:left w:w="70" w:type="dxa"/>
+              <w:bottom w:w="70" w:type="dxa"/>
+              <w:right w:w="70" w:type="dxa"/>
+            </w:tcMar>
+          </w:tcPr>
+          <w:p>
+            <w:pPr>
+              <w:spacing w:after="30" w:line="250" w:lineRule="auto"/>
+            </w:pPr>
+            <w:r>
+              <w:t>Open-command prediction</w:t>
+            </w:r>
+          </w:p>
+        </w:tc>
+        <w:tc>
+          <w:tcPr>
+            <w:tcW w:w="1700" w:type="dxa"/>
+            <w:tcMar>
+              <w:top w:w="70" w:type="dxa"/>
+              <w:left w:w="70" w:type="dxa"/>
+              <w:bottom w:w="70" w:type="dxa"/>
+              <w:right w:w="70" w:type="dxa"/>
+            </w:tcMar>
+          </w:tcPr>
+          <w:p>
+            <w:pPr>
+              <w:spacing w:after="30" w:line="250" w:lineRule="auto"/>
+            </w:pPr>
+            <w:r>
+              <w:t>0.000000000</w:t>
+            </w:r>
+          </w:p>
+        </w:tc>
+        <w:tc>
+          <w:tcPr>
+            <w:tcW w:w="1800" w:type="dxa"/>
+            <w:tcMar>
+              <w:top w:w="70" w:type="dxa"/>
+              <w:left w:w="70" w:type="dxa"/>
+              <w:bottom w:w="70" w:type="dxa"/>
+              <w:right w:w="70" w:type="dxa"/>
+            </w:tcMar>
+          </w:tcPr>
+          <w:p>
+            <w:pPr>
+              <w:spacing w:after="30" w:line="250" w:lineRule="auto"/>
+            </w:pPr>
+            <w:r>
+              <w:t>0.160000000</w:t>
+            </w:r>
+          </w:p>
+        </w:tc>
+        <w:tc>
+          <w:tcPr>
+            <w:tcW w:w="2600" w:type="dxa"/>
+            <w:tcMar>
+              <w:top w:w="70" w:type="dxa"/>
+              <w:left w:w="70" w:type="dxa"/>
+              <w:bottom w:w="70" w:type="dxa"/>
+              <w:right w:w="70" w:type="dxa"/>
+            </w:tcMar>
+          </w:tcPr>
+          <w:p>
+            <w:pPr>
+              <w:spacing w:after="30" w:line="250" w:lineRule="auto"/>
+            </w:pPr>
+            <w:r>
+              <w:t>16% command-success model</w:t>
+            </w:r>
+          </w:p>
+        </w:tc>
+      </w:tr>
+      <w:tr>
+        <w:tc>
+          <w:tcPr>
+            <w:tcW w:w="2100" w:type="dxa"/>
+            <w:tcMar>
+              <w:top w:w="70" w:type="dxa"/>
+              <w:left w:w="70" w:type="dxa"/>
+              <w:bottom w:w="70" w:type="dxa"/>
+              <w:right w:w="70" w:type="dxa"/>
+            </w:tcMar>
+          </w:tcPr>
+          <w:p>
+            <w:pPr>
+              <w:spacing w:after="30" w:line="250" w:lineRule="auto"/>
+            </w:pPr>
+            <w:r>
+              <w:t>Open measurement</w:t>
+            </w:r>
+          </w:p>
+        </w:tc>
+        <w:tc>
+          <w:tcPr>
+            <w:tcW w:w="1700" w:type="dxa"/>
+            <w:tcMar>
+              <w:top w:w="70" w:type="dxa"/>
+              <w:left w:w="70" w:type="dxa"/>
+              <w:bottom w:w="70" w:type="dxa"/>
+              <w:right w:w="70" w:type="dxa"/>
+            </w:tcMar>
+          </w:tcPr>
+          <w:p>
+            <w:pPr>
+              <w:spacing w:after="30" w:line="250" w:lineRule="auto"/>
+            </w:pPr>
+            <w:r>
+              <w:t>0.160000000</w:t>
+            </w:r>
+          </w:p>
+        </w:tc>
+        <w:tc>
+          <w:tcPr>
+            <w:tcW w:w="1800" w:type="dxa"/>
+            <w:tcMar>
+              <w:top w:w="70" w:type="dxa"/>
+              <w:left w:w="70" w:type="dxa"/>
+              <w:bottom w:w="70" w:type="dxa"/>
+              <w:right w:w="70" w:type="dxa"/>
+            </w:tcMar>
+          </w:tcPr>
+          <w:p>
+            <w:pPr>
+              <w:spacing w:after="30" w:line="250" w:lineRule="auto"/>
+            </w:pPr>
+            <w:r>
+              <w:t>0.958928885</w:t>
+            </w:r>
+          </w:p>
+        </w:tc>
+        <w:tc>
+          <w:tcPr>
+            <w:tcW w:w="2600" w:type="dxa"/>
+            <w:tcMar>
+              <w:top w:w="70" w:type="dxa"/>
+              <w:left w:w="70" w:type="dxa"/>
+              <w:bottom w:w="70" w:type="dxa"/>
+              <w:right w:w="70" w:type="dxa"/>
+            </w:tcMar>
+          </w:tcPr>
+          <w:p>
+            <w:pPr>
+              <w:spacing w:after="30" w:line="250" w:lineRule="auto"/>
+            </w:pPr>
+            <w:r>
+              <w:t>Strong evidence that door opened</w:t>
+            </w:r>
+          </w:p>
+        </w:tc>
+      </w:tr>
+      <w:tr>
+        <w:tc>
+          <w:tcPr>
+            <w:tcW w:w="2100" w:type="dxa"/>
+            <w:tcMar>
+              <w:top w:w="70" w:type="dxa"/>
+              <w:left w:w="70" w:type="dxa"/>
+              <w:bottom w:w="70" w:type="dxa"/>
+              <w:right w:w="70" w:type="dxa"/>
+            </w:tcMar>
+          </w:tcPr>
+          <w:p>
+            <w:pPr>
+              <w:spacing w:after="30" w:line="250" w:lineRule="auto"/>
+            </w:pPr>
+            <w:r>
+              <w:t>Open measurement</w:t>
+            </w:r>
+          </w:p>
+        </w:tc>
+        <w:tc>
+          <w:tcPr>
+            <w:tcW w:w="1700" w:type="dxa"/>
+            <w:tcMar>
+              <w:top w:w="70" w:type="dxa"/>
+              <w:left w:w="70" w:type="dxa"/>
+              <w:bottom w:w="70" w:type="dxa"/>
+              <w:right w:w="70" w:type="dxa"/>
+            </w:tcMar>
+          </w:tcPr>
+          <w:p>
+            <w:pPr>
+              <w:spacing w:after="30" w:line="250" w:lineRule="auto"/>
+            </w:pPr>
+            <w:r>
+              <w:t>0.958928885</w:t>
+            </w:r>
+          </w:p>
+        </w:tc>
+        <w:tc>
+          <w:tcPr>
+            <w:tcW w:w="1800" w:type="dxa"/>
+            <w:tcMar>
+              <w:top w:w="70" w:type="dxa"/>
+              <w:left w:w="70" w:type="dxa"/>
+              <w:bottom w:w="70" w:type="dxa"/>
+              <w:right w:w="70" w:type="dxa"/>
+            </w:tcMar>
+          </w:tcPr>
+          <w:p>
+            <w:pPr>
+              <w:spacing w:after="30" w:line="250" w:lineRule="auto"/>
+            </w:pPr>
+            <w:r>
+              <w:t>0.999650708</w:t>
+            </w:r>
+          </w:p>
+        </w:tc>
+        <w:tc>
+          <w:tcPr>
+            <w:tcW w:w="2600" w:type="dxa"/>
+            <w:tcMar>
+              <w:top w:w="70" w:type="dxa"/>
+              <w:left w:w="70" w:type="dxa"/>
+              <w:bottom w:w="70" w:type="dxa"/>
+              <w:right w:w="70" w:type="dxa"/>
+            </w:tcMar>
+          </w:tcPr>
+          <w:p>
+            <w:pPr>
+              <w:spacing w:after="30" w:line="250" w:lineRule="auto"/>
+            </w:pPr>
+            <w:r>
+              <w:t>Exceeds 0.99 decision threshold</w:t>
+            </w:r>
+          </w:p>
+        </w:tc>
+      </w:tr>
+      <w:tr>
+        <w:tc>
+          <w:tcPr>
+            <w:tcW w:w="2100" w:type="dxa"/>
+            <w:tcMar>
+              <w:top w:w="70" w:type="dxa"/>
+              <w:left w:w="70" w:type="dxa"/>
+              <w:bottom w:w="70" w:type="dxa"/>
+              <w:right w:w="70" w:type="dxa"/>
+            </w:tcMar>
+          </w:tcPr>
+          <w:p>
+            <w:pPr>
+              <w:spacing w:after="30" w:line="250" w:lineRule="auto"/>
+            </w:pPr>
+            <w:r>
+              <w:t>STATE DRIVING</w:t>
+            </w:r>
+          </w:p>
+        </w:tc>
+        <w:tc>
+          <w:tcPr>
+            <w:tcW w:w="1700" w:type="dxa"/>
+            <w:tcMar>
+              <w:top w:w="70" w:type="dxa"/>
+              <w:left w:w="70" w:type="dxa"/>
+              <w:bottom w:w="70" w:type="dxa"/>
+              <w:right w:w="70" w:type="dxa"/>
+            </w:tcMar>
+          </w:tcPr>
+          <w:p>
+            <w:pPr>
+              <w:spacing w:after="30" w:line="250" w:lineRule="auto"/>
+            </w:pPr>
+            <w:r>
+              <w:t>—</w:t>
+            </w:r>
+          </w:p>
+        </w:tc>
+        <w:tc>
+          <w:tcPr>
+            <w:tcW w:w="1800" w:type="dxa"/>
+            <w:tcMar>
+              <w:top w:w="70" w:type="dxa"/>
+              <w:left w:w="70" w:type="dxa"/>
+              <w:bottom w:w="70" w:type="dxa"/>
+              <w:right w:w="70" w:type="dxa"/>
+            </w:tcMar>
+          </w:tcPr>
+          <w:p>
+            <w:pPr>
+              <w:spacing w:after="30" w:line="250" w:lineRule="auto"/>
+            </w:pPr>
+            <w:r>
+              <w:t>0.999650708</w:t>
+            </w:r>
+          </w:p>
+        </w:tc>
+        <w:tc>
+          <w:tcPr>
+            <w:tcW w:w="2600" w:type="dxa"/>
+            <w:tcMar>
+              <w:top w:w="70" w:type="dxa"/>
+              <w:left w:w="70" w:type="dxa"/>
+              <w:bottom w:w="70" w:type="dxa"/>
+              <w:right w:w="70" w:type="dxa"/>
+            </w:tcMar>
+          </w:tcPr>
+          <w:p>
+            <w:pPr>
+              <w:spacing w:after="30" w:line="250" w:lineRule="auto"/>
+            </w:pPr>
+            <w:r>
+              <w:t>Robot moves only after threshold</w:t>
+            </w:r>
+          </w:p>
+        </w:tc>
+      </w:tr>
+      <w:tr>
+        <w:tc>
+          <w:tcPr>
+            <w:tcW w:w="2100" w:type="dxa"/>
+            <w:tcMar>
+              <w:top w:w="70" w:type="dxa"/>
+              <w:left w:w="70" w:type="dxa"/>
+              <w:bottom w:w="70" w:type="dxa"/>
+              <w:right w:w="70" w:type="dxa"/>
+            </w:tcMar>
+          </w:tcPr>
+          <w:p>
+            <w:pPr>
+              <w:spacing w:after="30" w:line="250" w:lineRule="auto"/>
+            </w:pPr>
+            <w:r>
+              <w:t>STOPPING / CLOSING / DONE</w:t>
+            </w:r>
+          </w:p>
+        </w:tc>
+        <w:tc>
+          <w:tcPr>
+            <w:tcW w:w="1700" w:type="dxa"/>
+            <w:tcMar>
+              <w:top w:w="70" w:type="dxa"/>
+              <w:left w:w="70" w:type="dxa"/>
+              <w:bottom w:w="70" w:type="dxa"/>
+              <w:right w:w="70" w:type="dxa"/>
+            </w:tcMar>
+          </w:tcPr>
+          <w:p>
+            <w:pPr>
+              <w:spacing w:after="30" w:line="250" w:lineRule="auto"/>
+            </w:pPr>
+            <w:r>
+              <w:t>—</w:t>
+            </w:r>
+          </w:p>
+        </w:tc>
+        <w:tc>
+          <w:tcPr>
+            <w:tcW w:w="1800" w:type="dxa"/>
+            <w:tcMar>
+              <w:top w:w="70" w:type="dxa"/>
+              <w:left w:w="70" w:type="dxa"/>
+              <w:bottom w:w="70" w:type="dxa"/>
+              <w:right w:w="70" w:type="dxa"/>
+            </w:tcMar>
+          </w:tcPr>
+          <w:p>
+            <w:pPr>
+              <w:spacing w:after="30" w:line="250" w:lineRule="auto"/>
+            </w:pPr>
+            <w:r>
+              <w:t>0.999650708</w:t>
+            </w:r>
+          </w:p>
+        </w:tc>
+        <w:tc>
+          <w:tcPr>
+            <w:tcW w:w="2600" w:type="dxa"/>
+            <w:tcMar>
+              <w:top w:w="70" w:type="dxa"/>
+              <w:left w:w="70" w:type="dxa"/>
+              <w:bottom w:w="70" w:type="dxa"/>
+              <w:right w:w="70" w:type="dxa"/>
+            </w:tcMar>
+          </w:tcPr>
+          <w:p>
+            <w:pPr>
+              <w:spacing w:after="30" w:line="250" w:lineRule="auto"/>
+            </w:pPr>
+            <w:r>
+              <w:t>Sequence completes safely</w:t>
+            </w:r>
+          </w:p>
+        </w:tc>
+      </w:tr>
+    </w:tbl>
+    <w:p>
+      <w:pPr>
+        <w:spacing w:after="100" w:line="250" w:lineRule="auto"/>
+      </w:pPr>
+      <w:r>
+        <w:t>The latest repeated closed-door calibration produced P(z=open | x=closed)=0.011338; the recorded controller used the earlier valid estimate 0.008065. The estimates are close and lead to the same decision behavior. The log shows repeated unsuccessful command predictions and closed measurements driving the belief back toward zero, followed by a successful command and two consistent open measurements that raise the posterior above 0.99.</w:t>
+      </w:r>
+    </w:p>
+    <w:p>
+      <w:pPr>
+        <w:spacing w:after="100" w:line="250" w:lineRule="auto"/>
+      </w:pPr>
+      <w:r>
+        <w:t>The initial geometry is intentional: the robot starts at x=-1.5, the door is at x=1.0, and the fire truck is beyond the doorway at x=12.0. The Gazebo camera perspective can make the robot appear to be on the opposite side, but it begins on the approach side and drives toward and through the door.</w:t>
+      </w:r>
+    </w:p>
+    <w:p>
+      <w:pPr>
+        <w:spacing w:after="100" w:line="250" w:lineRule="auto"/>
+      </w:pPr>
+      <w:r>
+        <w:t>Implementation: prob_rob_labs/src/lab3_bayes/filter.py and controller.py. Evidence: evidence/logs/assignment8_full_bayes.log and video/prob_rob_lab3_#8.mp4. The final video retains the launch parameters, failed inference, successful threshold crossing, driving, stopping, closing, and DONE states.</w:t>
+      </w:r>
+    </w:p>
+    <w:p>
+      <w:pPr>
+        <w:pStyle w:val="Heading3"/>
+        <w:spacing w:after="100" w:line="250" w:lineRule="auto"/>
+      </w:pPr>
+      <w:r>
+        <w:t>Final verification</w:t>
+      </w:r>
+    </w:p>
+    <w:p>
+      <w:pPr>
+        <w:spacing w:after="100" w:line="250" w:lineRule="auto"/>
+      </w:pPr>
+      <w:r>
+        <w:t>The Lab 3 Bayes-filter and door-sequence test suites completed successfully: 24 tests passed. The controller never commanded forward motion below its configured belief threshold in the recorded Assignment 6 and Assignment 8 demonstrations.</w:t>
       </w:r>
     </w:p>
     <w:sectPr>

</xml_diff>